<commit_message>
added report generation for pms log
</commit_message>
<xml_diff>
--- a/report_template/maintenance_temp.docx
+++ b/report_template/maintenance_temp.docx
@@ -921,711 +921,6 @@
         </w:rPr>
       </w:pPr>
     </w:p>
-    <w:p>
-      <w:pPr>
-        <w:keepNext/>
-        <w:spacing w:after="0" w:line="240" w:lineRule="auto"/>
-        <w:jc w:val="both"/>
-        <w:rPr>
-          <w:rFonts w:ascii="Arial" w:eastAsia="Arial" w:hAnsi="Arial" w:cs="Arial"/>
-        </w:rPr>
-      </w:pPr>
-      <w:r>
-        <w:rPr>
-          <w:rFonts w:ascii="Arial" w:eastAsia="Arial" w:hAnsi="Arial" w:cs="Arial"/>
-        </w:rPr>
-        <w:lastRenderedPageBreak/>
-        <w:t xml:space="preserve">Report ID: </w:t>
-      </w:r>
-    </w:p>
-    <w:p>
-      <w:pPr>
-        <w:keepNext/>
-        <w:spacing w:after="0" w:line="240" w:lineRule="auto"/>
-        <w:jc w:val="both"/>
-        <w:rPr>
-          <w:rFonts w:ascii="Arial" w:eastAsia="Arial" w:hAnsi="Arial" w:cs="Arial"/>
-        </w:rPr>
-      </w:pPr>
-      <w:r>
-        <w:rPr>
-          <w:rFonts w:ascii="Arial" w:eastAsia="Arial" w:hAnsi="Arial" w:cs="Arial"/>
-        </w:rPr>
-        <w:t>Generated by: {{</w:t>
-      </w:r>
-      <w:proofErr w:type="spellStart"/>
-      <w:r>
-        <w:rPr>
-          <w:rFonts w:ascii="Arial" w:eastAsia="Arial" w:hAnsi="Arial" w:cs="Arial"/>
-        </w:rPr>
-        <w:t>generated_by</w:t>
-      </w:r>
-      <w:proofErr w:type="spellEnd"/>
-      <w:r>
-        <w:rPr>
-          <w:rFonts w:ascii="Arial" w:eastAsia="Arial" w:hAnsi="Arial" w:cs="Arial"/>
-        </w:rPr>
-        <w:t>}}</w:t>
-      </w:r>
-    </w:p>
-    <w:p>
-      <w:pPr>
-        <w:keepNext/>
-        <w:spacing w:after="0" w:line="240" w:lineRule="auto"/>
-        <w:jc w:val="both"/>
-        <w:rPr>
-          <w:rFonts w:ascii="Arial" w:eastAsia="Arial" w:hAnsi="Arial" w:cs="Arial"/>
-        </w:rPr>
-      </w:pPr>
-      <w:r>
-        <w:rPr>
-          <w:rFonts w:ascii="Arial" w:eastAsia="Arial" w:hAnsi="Arial" w:cs="Arial"/>
-        </w:rPr>
-        <w:t>Date &amp; Time Generated: {{</w:t>
-      </w:r>
-      <w:proofErr w:type="spellStart"/>
-      <w:r>
-        <w:rPr>
-          <w:rFonts w:ascii="Arial" w:eastAsia="Arial" w:hAnsi="Arial" w:cs="Arial"/>
-        </w:rPr>
-        <w:t>generated_on</w:t>
-      </w:r>
-      <w:proofErr w:type="spellEnd"/>
-      <w:r>
-        <w:rPr>
-          <w:rFonts w:ascii="Arial" w:eastAsia="Arial" w:hAnsi="Arial" w:cs="Arial"/>
-        </w:rPr>
-        <w:t>}}</w:t>
-      </w:r>
-    </w:p>
-    <w:p>
-      <w:pPr>
-        <w:keepNext/>
-        <w:spacing w:after="0" w:line="240" w:lineRule="auto"/>
-        <w:jc w:val="both"/>
-        <w:rPr>
-          <w:rFonts w:ascii="Arial" w:eastAsia="Arial" w:hAnsi="Arial" w:cs="Arial"/>
-        </w:rPr>
-      </w:pPr>
-      <w:r>
-        <w:rPr>
-          <w:rFonts w:ascii="Arial" w:eastAsia="Arial" w:hAnsi="Arial" w:cs="Arial"/>
-        </w:rPr>
-        <w:t>Requested By: (Department/Office)</w:t>
-      </w:r>
-    </w:p>
-    <w:p>
-      <w:pPr>
-        <w:keepNext/>
-        <w:spacing w:after="0" w:line="240" w:lineRule="auto"/>
-        <w:jc w:val="both"/>
-        <w:rPr>
-          <w:rFonts w:ascii="Arial" w:eastAsia="Arial" w:hAnsi="Arial" w:cs="Arial"/>
-          <w:b/>
-          <w:bCs/>
-        </w:rPr>
-      </w:pPr>
-    </w:p>
-    <w:p>
-      <w:pPr>
-        <w:keepNext/>
-        <w:spacing w:after="0" w:line="240" w:lineRule="auto"/>
-        <w:rPr>
-          <w:rFonts w:ascii="Arial" w:eastAsia="Arial" w:hAnsi="Arial" w:cs="Arial"/>
-          <w:b/>
-          <w:bCs/>
-        </w:rPr>
-      </w:pPr>
-      <w:r>
-        <w:rPr>
-          <w:rFonts w:ascii="Arial" w:eastAsia="Arial" w:hAnsi="Arial" w:cs="Arial"/>
-          <w:b/>
-          <w:bCs/>
-        </w:rPr>
-        <w:t xml:space="preserve">PREVENTIVE MAINTENANCE LOG AS OF </w:t>
-      </w:r>
-      <w:r>
-        <w:rPr>
-          <w:rFonts w:ascii="Arial" w:hAnsi="Arial" w:cs="Arial"/>
-          <w:b/>
-          <w:bCs/>
-          <w:u w:val="single"/>
-        </w:rPr>
-        <w:t>{{</w:t>
-      </w:r>
-      <w:proofErr w:type="spellStart"/>
-      <w:r>
-        <w:rPr>
-          <w:rFonts w:ascii="Arial" w:hAnsi="Arial" w:cs="Arial"/>
-          <w:b/>
-          <w:bCs/>
-          <w:u w:val="single"/>
-        </w:rPr>
-        <w:t>month_year</w:t>
-      </w:r>
-      <w:proofErr w:type="spellEnd"/>
-      <w:r>
-        <w:rPr>
-          <w:rFonts w:ascii="Arial" w:hAnsi="Arial" w:cs="Arial"/>
-          <w:b/>
-          <w:bCs/>
-          <w:u w:val="single"/>
-        </w:rPr>
-        <w:t>}}</w:t>
-      </w:r>
-      <w:r>
-        <w:rPr>
-          <w:rFonts w:ascii="Arial" w:eastAsia="Arial" w:hAnsi="Arial" w:cs="Arial"/>
-          <w:b/>
-          <w:bCs/>
-        </w:rPr>
-        <w:br/>
-      </w:r>
-    </w:p>
-    <w:tbl>
-      <w:tblPr>
-        <w:tblStyle w:val="a"/>
-        <w:tblW w:w="9360" w:type="dxa"/>
-        <w:tblInd w:w="0" w:type="dxa"/>
-        <w:tblBorders>
-          <w:top w:val="single" w:sz="8" w:space="0" w:color="000000"/>
-          <w:left w:val="single" w:sz="8" w:space="0" w:color="000000"/>
-          <w:bottom w:val="single" w:sz="8" w:space="0" w:color="000000"/>
-          <w:right w:val="single" w:sz="8" w:space="0" w:color="000000"/>
-          <w:insideH w:val="single" w:sz="8" w:space="0" w:color="000000"/>
-          <w:insideV w:val="single" w:sz="8" w:space="0" w:color="000000"/>
-        </w:tblBorders>
-        <w:tblLayout w:type="fixed"/>
-        <w:tblLook w:val="0600" w:firstRow="0" w:lastRow="0" w:firstColumn="0" w:lastColumn="0" w:noHBand="1" w:noVBand="1"/>
-      </w:tblPr>
-      <w:tblGrid>
-        <w:gridCol w:w="2117"/>
-        <w:gridCol w:w="1627"/>
-        <w:gridCol w:w="2342"/>
-        <w:gridCol w:w="1402"/>
-        <w:gridCol w:w="1872"/>
-      </w:tblGrid>
-      <w:tr>
-        <w:tc>
-          <w:tcPr>
-            <w:tcW w:w="2117" w:type="dxa"/>
-            <w:tcMar>
-              <w:top w:w="100" w:type="dxa"/>
-              <w:left w:w="100" w:type="dxa"/>
-              <w:bottom w:w="100" w:type="dxa"/>
-              <w:right w:w="100" w:type="dxa"/>
-            </w:tcMar>
-          </w:tcPr>
-          <w:p>
-            <w:pPr>
-              <w:widowControl w:val="0"/>
-              <w:pBdr>
-                <w:top w:val="nil"/>
-                <w:left w:val="nil"/>
-                <w:bottom w:val="nil"/>
-                <w:right w:val="nil"/>
-                <w:between w:val="nil"/>
-              </w:pBdr>
-              <w:spacing w:after="0" w:line="240" w:lineRule="auto"/>
-              <w:jc w:val="center"/>
-              <w:rPr>
-                <w:rFonts w:ascii="Arial" w:eastAsia="Arial" w:hAnsi="Arial" w:cs="Arial"/>
-                <w:b/>
-                <w:bCs/>
-              </w:rPr>
-            </w:pPr>
-            <w:r>
-              <w:rPr>
-                <w:rFonts w:ascii="Arial" w:eastAsia="Arial" w:hAnsi="Arial" w:cs="Arial"/>
-                <w:b/>
-                <w:bCs/>
-              </w:rPr>
-              <w:t>Vehicle Name</w:t>
-            </w:r>
-          </w:p>
-        </w:tc>
-        <w:tc>
-          <w:tcPr>
-            <w:tcW w:w="1627" w:type="dxa"/>
-            <w:tcMar>
-              <w:top w:w="100" w:type="dxa"/>
-              <w:left w:w="100" w:type="dxa"/>
-              <w:bottom w:w="100" w:type="dxa"/>
-              <w:right w:w="100" w:type="dxa"/>
-            </w:tcMar>
-          </w:tcPr>
-          <w:p>
-            <w:pPr>
-              <w:widowControl w:val="0"/>
-              <w:pBdr>
-                <w:top w:val="nil"/>
-                <w:left w:val="nil"/>
-                <w:bottom w:val="nil"/>
-                <w:right w:val="nil"/>
-                <w:between w:val="nil"/>
-              </w:pBdr>
-              <w:spacing w:after="0" w:line="240" w:lineRule="auto"/>
-              <w:jc w:val="center"/>
-              <w:rPr>
-                <w:rFonts w:ascii="Arial" w:eastAsia="Arial" w:hAnsi="Arial" w:cs="Arial"/>
-                <w:b/>
-                <w:bCs/>
-              </w:rPr>
-            </w:pPr>
-            <w:r>
-              <w:rPr>
-                <w:rFonts w:ascii="Arial" w:eastAsia="Arial" w:hAnsi="Arial" w:cs="Arial"/>
-                <w:b/>
-                <w:bCs/>
-              </w:rPr>
-              <w:t>Last PMS</w:t>
-            </w:r>
-          </w:p>
-        </w:tc>
-        <w:tc>
-          <w:tcPr>
-            <w:tcW w:w="2342" w:type="dxa"/>
-            <w:tcMar>
-              <w:top w:w="100" w:type="dxa"/>
-              <w:left w:w="100" w:type="dxa"/>
-              <w:bottom w:w="100" w:type="dxa"/>
-              <w:right w:w="100" w:type="dxa"/>
-            </w:tcMar>
-          </w:tcPr>
-          <w:p>
-            <w:pPr>
-              <w:widowControl w:val="0"/>
-              <w:pBdr>
-                <w:top w:val="nil"/>
-                <w:left w:val="nil"/>
-                <w:bottom w:val="nil"/>
-                <w:right w:val="nil"/>
-                <w:between w:val="nil"/>
-              </w:pBdr>
-              <w:spacing w:after="0" w:line="240" w:lineRule="auto"/>
-              <w:jc w:val="center"/>
-              <w:rPr>
-                <w:rFonts w:ascii="Arial" w:eastAsia="Arial" w:hAnsi="Arial" w:cs="Arial"/>
-                <w:b/>
-                <w:bCs/>
-              </w:rPr>
-            </w:pPr>
-            <w:r>
-              <w:rPr>
-                <w:rFonts w:ascii="Arial" w:eastAsia="Arial" w:hAnsi="Arial" w:cs="Arial"/>
-                <w:b/>
-                <w:bCs/>
-              </w:rPr>
-              <w:t>Kilometer</w:t>
-            </w:r>
-          </w:p>
-        </w:tc>
-        <w:tc>
-          <w:tcPr>
-            <w:tcW w:w="1402" w:type="dxa"/>
-            <w:tcMar>
-              <w:top w:w="100" w:type="dxa"/>
-              <w:left w:w="100" w:type="dxa"/>
-              <w:bottom w:w="100" w:type="dxa"/>
-              <w:right w:w="100" w:type="dxa"/>
-            </w:tcMar>
-          </w:tcPr>
-          <w:p>
-            <w:pPr>
-              <w:widowControl w:val="0"/>
-              <w:pBdr>
-                <w:top w:val="nil"/>
-                <w:left w:val="nil"/>
-                <w:bottom w:val="nil"/>
-                <w:right w:val="nil"/>
-                <w:between w:val="nil"/>
-              </w:pBdr>
-              <w:spacing w:after="0" w:line="240" w:lineRule="auto"/>
-              <w:jc w:val="center"/>
-              <w:rPr>
-                <w:rFonts w:ascii="Arial" w:eastAsia="Arial" w:hAnsi="Arial" w:cs="Arial"/>
-                <w:b/>
-                <w:bCs/>
-              </w:rPr>
-            </w:pPr>
-            <w:r>
-              <w:rPr>
-                <w:rFonts w:ascii="Arial" w:eastAsia="Arial" w:hAnsi="Arial" w:cs="Arial"/>
-                <w:b/>
-                <w:bCs/>
-              </w:rPr>
-              <w:t>Oil (L)</w:t>
-            </w:r>
-          </w:p>
-        </w:tc>
-        <w:tc>
-          <w:tcPr>
-            <w:tcW w:w="1872" w:type="dxa"/>
-            <w:tcMar>
-              <w:top w:w="100" w:type="dxa"/>
-              <w:left w:w="100" w:type="dxa"/>
-              <w:bottom w:w="100" w:type="dxa"/>
-              <w:right w:w="100" w:type="dxa"/>
-            </w:tcMar>
-          </w:tcPr>
-          <w:p>
-            <w:pPr>
-              <w:widowControl w:val="0"/>
-              <w:pBdr>
-                <w:top w:val="nil"/>
-                <w:left w:val="nil"/>
-                <w:bottom w:val="nil"/>
-                <w:right w:val="nil"/>
-                <w:between w:val="nil"/>
-              </w:pBdr>
-              <w:spacing w:after="0" w:line="240" w:lineRule="auto"/>
-              <w:jc w:val="center"/>
-              <w:rPr>
-                <w:rFonts w:ascii="Arial" w:eastAsia="Arial" w:hAnsi="Arial" w:cs="Arial"/>
-                <w:b/>
-                <w:bCs/>
-              </w:rPr>
-            </w:pPr>
-            <w:r>
-              <w:rPr>
-                <w:rFonts w:ascii="Arial" w:eastAsia="Arial" w:hAnsi="Arial" w:cs="Arial"/>
-                <w:b/>
-                <w:bCs/>
-              </w:rPr>
-              <w:t>Next PMS</w:t>
-            </w:r>
-          </w:p>
-        </w:tc>
-      </w:tr>
-    </w:tbl>
-    <w:p>
-      <w:pPr>
-        <w:keepNext/>
-        <w:spacing w:after="0" w:line="240" w:lineRule="auto"/>
-        <w:jc w:val="center"/>
-        <w:rPr>
-          <w:rFonts w:ascii="Arial" w:eastAsia="Arial" w:hAnsi="Arial" w:cs="Arial"/>
-          <w:b/>
-          <w:bCs/>
-        </w:rPr>
-      </w:pPr>
-    </w:p>
-    <w:p>
-      <w:pPr>
-        <w:keepNext/>
-        <w:spacing w:after="0" w:line="240" w:lineRule="auto"/>
-        <w:jc w:val="both"/>
-        <w:rPr>
-          <w:rFonts w:ascii="Arial" w:eastAsia="Arial" w:hAnsi="Arial" w:cs="Arial"/>
-          <w:b/>
-          <w:bCs/>
-        </w:rPr>
-      </w:pPr>
-    </w:p>
-    <w:p>
-      <w:pPr>
-        <w:keepNext/>
-        <w:spacing w:after="0" w:line="240" w:lineRule="auto"/>
-        <w:jc w:val="both"/>
-        <w:rPr>
-          <w:rFonts w:ascii="Arial" w:eastAsia="Arial" w:hAnsi="Arial" w:cs="Arial"/>
-        </w:rPr>
-      </w:pPr>
-      <w:r>
-        <w:rPr>
-          <w:rFonts w:ascii="Arial" w:eastAsia="Arial" w:hAnsi="Arial" w:cs="Arial"/>
-        </w:rPr>
-        <w:tab/>
-      </w:r>
-      <w:r>
-        <w:rPr>
-          <w:rFonts w:ascii="Arial" w:eastAsia="Arial" w:hAnsi="Arial" w:cs="Arial"/>
-        </w:rPr>
-        <w:tab/>
-      </w:r>
-      <w:r>
-        <w:rPr>
-          <w:rFonts w:ascii="Arial" w:eastAsia="Arial" w:hAnsi="Arial" w:cs="Arial"/>
-        </w:rPr>
-        <w:tab/>
-      </w:r>
-      <w:r>
-        <w:rPr>
-          <w:rFonts w:ascii="Arial" w:eastAsia="Arial" w:hAnsi="Arial" w:cs="Arial"/>
-        </w:rPr>
-        <w:tab/>
-      </w:r>
-      <w:r>
-        <w:rPr>
-          <w:rFonts w:ascii="Arial" w:eastAsia="Arial" w:hAnsi="Arial" w:cs="Arial"/>
-        </w:rPr>
-        <w:tab/>
-      </w:r>
-      <w:r>
-        <w:rPr>
-          <w:rFonts w:ascii="Arial" w:eastAsia="Arial" w:hAnsi="Arial" w:cs="Arial"/>
-        </w:rPr>
-        <w:tab/>
-      </w:r>
-      <w:r>
-        <w:rPr>
-          <w:rFonts w:ascii="Arial" w:eastAsia="Arial" w:hAnsi="Arial" w:cs="Arial"/>
-        </w:rPr>
-        <w:tab/>
-      </w:r>
-      <w:r>
-        <w:rPr>
-          <w:rFonts w:ascii="Arial" w:eastAsia="Arial" w:hAnsi="Arial" w:cs="Arial"/>
-        </w:rPr>
-        <w:tab/>
-      </w:r>
-      <w:r>
-        <w:rPr>
-          <w:rFonts w:ascii="Arial" w:eastAsia="Arial" w:hAnsi="Arial" w:cs="Arial"/>
-        </w:rPr>
-        <w:tab/>
-      </w:r>
-    </w:p>
-    <w:p>
-      <w:pPr>
-        <w:keepNext/>
-        <w:spacing w:after="0" w:line="240" w:lineRule="auto"/>
-        <w:jc w:val="both"/>
-        <w:rPr>
-          <w:rFonts w:ascii="Arial" w:eastAsia="Arial" w:hAnsi="Arial" w:cs="Arial"/>
-        </w:rPr>
-      </w:pPr>
-    </w:p>
-    <w:p>
-      <w:pPr>
-        <w:keepNext/>
-        <w:spacing w:after="0" w:line="240" w:lineRule="auto"/>
-        <w:jc w:val="both"/>
-        <w:rPr>
-          <w:rFonts w:ascii="Arial" w:eastAsia="Arial" w:hAnsi="Arial" w:cs="Arial"/>
-        </w:rPr>
-      </w:pPr>
-      <w:r>
-        <w:rPr>
-          <w:rFonts w:ascii="Arial" w:eastAsia="Arial" w:hAnsi="Arial" w:cs="Arial"/>
-        </w:rPr>
-        <w:t>Prepared by:</w:t>
-      </w:r>
-    </w:p>
-    <w:p>
-      <w:pPr>
-        <w:keepNext/>
-        <w:spacing w:after="0" w:line="240" w:lineRule="auto"/>
-        <w:jc w:val="both"/>
-        <w:rPr>
-          <w:rFonts w:ascii="Arial" w:eastAsia="Arial" w:hAnsi="Arial" w:cs="Arial"/>
-        </w:rPr>
-      </w:pPr>
-      <w:r>
-        <w:rPr>
-          <w:rFonts w:ascii="Arial" w:eastAsia="Arial" w:hAnsi="Arial" w:cs="Arial"/>
-        </w:rPr>
-        <w:t>Checked by:</w:t>
-      </w:r>
-    </w:p>
-    <w:p>
-      <w:pPr>
-        <w:keepNext/>
-        <w:spacing w:after="0" w:line="240" w:lineRule="auto"/>
-        <w:jc w:val="both"/>
-        <w:rPr>
-          <w:rFonts w:ascii="Arial" w:eastAsia="Arial" w:hAnsi="Arial" w:cs="Arial"/>
-        </w:rPr>
-      </w:pPr>
-      <w:r>
-        <w:rPr>
-          <w:rFonts w:ascii="Arial" w:eastAsia="Arial" w:hAnsi="Arial" w:cs="Arial"/>
-        </w:rPr>
-        <w:t>Approved by:</w:t>
-      </w:r>
-    </w:p>
-    <w:p>
-      <w:pPr>
-        <w:keepNext/>
-        <w:spacing w:after="0" w:line="240" w:lineRule="auto"/>
-        <w:jc w:val="both"/>
-        <w:rPr>
-          <w:rFonts w:ascii="Arial" w:eastAsia="Arial" w:hAnsi="Arial" w:cs="Arial"/>
-        </w:rPr>
-      </w:pPr>
-      <w:r>
-        <w:rPr>
-          <w:rFonts w:ascii="Arial" w:eastAsia="Arial" w:hAnsi="Arial" w:cs="Arial"/>
-        </w:rPr>
-        <w:t>Position:</w:t>
-      </w:r>
-    </w:p>
-    <w:p>
-      <w:pPr>
-        <w:keepNext/>
-        <w:spacing w:after="0" w:line="240" w:lineRule="auto"/>
-        <w:jc w:val="both"/>
-        <w:rPr>
-          <w:rFonts w:ascii="Arial" w:eastAsia="Arial" w:hAnsi="Arial" w:cs="Arial"/>
-        </w:rPr>
-      </w:pPr>
-      <w:r>
-        <w:rPr>
-          <w:rFonts w:ascii="Arial" w:eastAsia="Arial" w:hAnsi="Arial" w:cs="Arial"/>
-        </w:rPr>
-        <w:t>Date:</w:t>
-      </w:r>
-    </w:p>
-    <w:p>
-      <w:pPr>
-        <w:keepNext/>
-        <w:spacing w:after="0" w:line="240" w:lineRule="auto"/>
-        <w:jc w:val="both"/>
-        <w:rPr>
-          <w:rFonts w:ascii="Arial" w:eastAsia="Arial" w:hAnsi="Arial" w:cs="Arial"/>
-          <w:b/>
-          <w:bCs/>
-        </w:rPr>
-      </w:pPr>
-    </w:p>
-    <w:p>
-      <w:pPr>
-        <w:keepNext/>
-        <w:spacing w:after="0" w:line="240" w:lineRule="auto"/>
-        <w:jc w:val="both"/>
-        <w:rPr>
-          <w:rFonts w:ascii="Arial" w:eastAsia="Arial" w:hAnsi="Arial" w:cs="Arial"/>
-          <w:b/>
-          <w:bCs/>
-        </w:rPr>
-      </w:pPr>
-    </w:p>
-    <w:p>
-      <w:pPr>
-        <w:keepNext/>
-        <w:spacing w:after="0" w:line="240" w:lineRule="auto"/>
-        <w:jc w:val="both"/>
-        <w:rPr>
-          <w:rFonts w:ascii="Arial" w:eastAsia="Arial" w:hAnsi="Arial" w:cs="Arial"/>
-          <w:b/>
-          <w:bCs/>
-        </w:rPr>
-      </w:pPr>
-    </w:p>
-    <w:p>
-      <w:pPr>
-        <w:keepNext/>
-        <w:spacing w:after="0" w:line="240" w:lineRule="auto"/>
-        <w:jc w:val="both"/>
-        <w:rPr>
-          <w:rFonts w:ascii="Arial" w:eastAsia="Arial" w:hAnsi="Arial" w:cs="Arial"/>
-        </w:rPr>
-      </w:pPr>
-    </w:p>
-    <w:p>
-      <w:pPr>
-        <w:jc w:val="both"/>
-        <w:rPr>
-          <w:rFonts w:ascii="Arial" w:eastAsia="Arial" w:hAnsi="Arial" w:cs="Arial"/>
-        </w:rPr>
-      </w:pPr>
-    </w:p>
-    <w:p>
-      <w:pPr>
-        <w:jc w:val="both"/>
-        <w:rPr>
-          <w:rFonts w:ascii="Arial" w:eastAsia="Arial" w:hAnsi="Arial" w:cs="Arial"/>
-        </w:rPr>
-      </w:pPr>
-    </w:p>
-    <w:p>
-      <w:pPr>
-        <w:jc w:val="both"/>
-        <w:rPr>
-          <w:rFonts w:ascii="Arial" w:eastAsia="Arial" w:hAnsi="Arial" w:cs="Arial"/>
-        </w:rPr>
-      </w:pPr>
-    </w:p>
-    <w:p>
-      <w:pPr>
-        <w:jc w:val="both"/>
-        <w:rPr>
-          <w:rFonts w:ascii="Arial" w:eastAsia="Arial" w:hAnsi="Arial" w:cs="Arial"/>
-        </w:rPr>
-      </w:pPr>
-    </w:p>
-    <w:p>
-      <w:pPr>
-        <w:jc w:val="both"/>
-        <w:rPr>
-          <w:rFonts w:ascii="Arial" w:eastAsia="Arial" w:hAnsi="Arial" w:cs="Arial"/>
-        </w:rPr>
-      </w:pPr>
-    </w:p>
-    <w:p>
-      <w:pPr>
-        <w:jc w:val="both"/>
-        <w:rPr>
-          <w:rFonts w:ascii="Arial" w:eastAsia="Arial" w:hAnsi="Arial" w:cs="Arial"/>
-        </w:rPr>
-      </w:pPr>
-    </w:p>
-    <w:p>
-      <w:pPr>
-        <w:jc w:val="both"/>
-        <w:rPr>
-          <w:rFonts w:ascii="Arial" w:eastAsia="Arial" w:hAnsi="Arial" w:cs="Arial"/>
-        </w:rPr>
-      </w:pPr>
-    </w:p>
-    <w:p>
-      <w:pPr>
-        <w:jc w:val="both"/>
-        <w:rPr>
-          <w:rFonts w:ascii="Arial" w:eastAsia="Arial" w:hAnsi="Arial" w:cs="Arial"/>
-        </w:rPr>
-      </w:pPr>
-    </w:p>
-    <w:p>
-      <w:pPr>
-        <w:jc w:val="both"/>
-        <w:rPr>
-          <w:rFonts w:ascii="Arial" w:eastAsia="Arial" w:hAnsi="Arial" w:cs="Arial"/>
-        </w:rPr>
-      </w:pPr>
-    </w:p>
-    <w:p>
-      <w:pPr>
-        <w:jc w:val="both"/>
-        <w:rPr>
-          <w:rFonts w:ascii="Arial" w:eastAsia="Arial" w:hAnsi="Arial" w:cs="Arial"/>
-        </w:rPr>
-      </w:pPr>
-    </w:p>
-    <w:p>
-      <w:pPr>
-        <w:jc w:val="both"/>
-        <w:rPr>
-          <w:rFonts w:ascii="Arial" w:eastAsia="Arial" w:hAnsi="Arial" w:cs="Arial"/>
-        </w:rPr>
-      </w:pPr>
-    </w:p>
-    <w:p>
-      <w:pPr>
-        <w:jc w:val="both"/>
-        <w:rPr>
-          <w:rFonts w:ascii="Arial" w:eastAsia="Arial" w:hAnsi="Arial" w:cs="Arial"/>
-        </w:rPr>
-      </w:pPr>
-    </w:p>
-    <w:p>
-      <w:pPr>
-        <w:jc w:val="both"/>
-        <w:rPr>
-          <w:rFonts w:ascii="Arial" w:eastAsia="Arial" w:hAnsi="Arial" w:cs="Arial"/>
-        </w:rPr>
-      </w:pPr>
-    </w:p>
     <w:sectPr>
       <w:headerReference w:type="default" r:id="rId6"/>
       <w:footerReference w:type="default" r:id="rId7"/>
@@ -2286,7 +1581,7 @@
             </wp:anchor>
           </w:drawing>
         </mc:Choice>
-        <mc:Fallback xmlns:sl="http://schemas.openxmlformats.org/schemaLibrary/2006/main" xmlns:a="http://schemas.openxmlformats.org/drawingml/2006/main" xmlns:pic="http://schemas.openxmlformats.org/drawingml/2006/picture" xmlns:c="http://schemas.openxmlformats.org/drawingml/2006/chart" xmlns:lc="http://schemas.openxmlformats.org/drawingml/2006/lockedCanvas" xmlns:dgm="http://schemas.openxmlformats.org/drawingml/2006/diagram" xmlns="http://schemas.microsoft.com/office/tasks/2019/documenttasks" xmlns:cr="http://schemas.microsoft.com/office/comments/2020/reactions">
+        <mc:Fallback xmlns:cr="http://schemas.microsoft.com/office/comments/2020/reactions" xmlns="http://schemas.microsoft.com/office/tasks/2019/documenttasks" xmlns:dgm="http://schemas.openxmlformats.org/drawingml/2006/diagram" xmlns:lc="http://schemas.openxmlformats.org/drawingml/2006/lockedCanvas" xmlns:c="http://schemas.openxmlformats.org/drawingml/2006/chart" xmlns:pic="http://schemas.openxmlformats.org/drawingml/2006/picture" xmlns:a="http://schemas.openxmlformats.org/drawingml/2006/main" xmlns:sl="http://schemas.openxmlformats.org/schemaLibrary/2006/main">
           <w:drawing>
             <wp:anchor allowOverlap="1" behindDoc="0" distB="0" distT="0" distL="114300" distR="114300" hidden="0" layoutInCell="1" locked="0" relativeHeight="0" simplePos="0">
               <wp:simplePos x="0" y="0"/>

</xml_diff>